<commit_message>
Remove Dancing Queen's outro
Per the updated source chord sheet: dropped the trailing "D/F# A/E /
Ooh ooh ooh" tag and the entire [Outro] section. The song now ends
on the second "Digging the dancing queen" repeat inside the final
Chorus. Confirmed via diff that nothing else in the chart changed.

Co-Authored-By: Claude Sonnet 5 <noreply@anthropic.com>
Claude-Session: https://claude.ai/code/session_01VAaiXhx9wytCGGEnHUzCxJ
</commit_message>
<xml_diff>
--- a/September/Dancing_Queen_Chords_by_Luka_Bloom.docx
+++ b/September/Dancing_Queen_Chords_by_Luka_Bloom.docx
@@ -588,7 +588,137 @@
           <w:sz w:val="22"/>
           <w:szCs w:val="22"/>
         </w:rPr>
-        <w:t xml:space="preserve">         E  </w:t>
+        <w:t xml:space="preserve">         </w:t>
+      </w:r>
+      <w:proofErr w:type="gramStart"/>
+      <w:r>
+        <w:rPr>
+          <w:rFonts w:ascii="Courier New" w:hAnsi="Courier New" w:cs="Courier New"/>
+          <w:sz w:val="22"/>
+          <w:szCs w:val="22"/>
+        </w:rPr>
+        <w:t xml:space="preserve">E  </w:t>
+      </w:r>
+      <w:proofErr w:type="spellStart"/>
+      <w:r>
+        <w:rPr>
+          <w:rFonts w:ascii="Courier New" w:hAnsi="Courier New" w:cs="Courier New"/>
+          <w:sz w:val="22"/>
+          <w:szCs w:val="22"/>
+        </w:rPr>
+        <w:t>F</w:t>
+      </w:r>
+      <w:proofErr w:type="gramEnd"/>
+      <w:r>
+        <w:rPr>
+          <w:rFonts w:ascii="Courier New" w:hAnsi="Courier New" w:cs="Courier New"/>
+          <w:sz w:val="22"/>
+          <w:szCs w:val="22"/>
+        </w:rPr>
+        <w:t>#m</w:t>
+      </w:r>
+      <w:proofErr w:type="spellEnd"/>
+    </w:p>
+    <w:p>
+      <w:pPr>
+        <w:rPr>
+          <w:rFonts w:ascii="Courier New" w:hAnsi="Courier New" w:cs="Courier New"/>
+          <w:sz w:val="22"/>
+          <w:szCs w:val="22"/>
+        </w:rPr>
+      </w:pPr>
+      <w:r>
+        <w:rPr>
+          <w:rFonts w:ascii="Courier New" w:hAnsi="Courier New" w:cs="Courier New"/>
+          <w:sz w:val="22"/>
+          <w:szCs w:val="22"/>
+        </w:rPr>
+        <w:t>You come to look for a king</w:t>
+      </w:r>
+    </w:p>
+    <w:p>
+      <w:pPr>
+        <w:rPr>
+          <w:rFonts w:ascii="Courier New" w:hAnsi="Courier New" w:cs="Courier New"/>
+          <w:sz w:val="22"/>
+          <w:szCs w:val="22"/>
+        </w:rPr>
+      </w:pPr>
+      <w:r>
+        <w:rPr>
+          <w:rFonts w:ascii="Courier New" w:hAnsi="Courier New" w:cs="Courier New"/>
+          <w:sz w:val="22"/>
+          <w:szCs w:val="22"/>
+        </w:rPr>
+        <w:t xml:space="preserve"> </w:t>
+      </w:r>
+    </w:p>
+    <w:p>
+      <w:pPr>
+        <w:rPr>
+          <w:rFonts w:ascii="Courier New" w:hAnsi="Courier New" w:cs="Courier New"/>
+          <w:sz w:val="22"/>
+          <w:szCs w:val="22"/>
+        </w:rPr>
+      </w:pPr>
+      <w:r>
+        <w:rPr>
+          <w:rFonts w:ascii="Courier New" w:hAnsi="Courier New" w:cs="Courier New"/>
+          <w:sz w:val="22"/>
+          <w:szCs w:val="22"/>
+        </w:rPr>
+        <w:t>[Verse 2]</w:t>
+      </w:r>
+    </w:p>
+    <w:p>
+      <w:pPr>
+        <w:rPr>
+          <w:rFonts w:ascii="Courier New" w:hAnsi="Courier New" w:cs="Courier New"/>
+          <w:sz w:val="22"/>
+          <w:szCs w:val="22"/>
+        </w:rPr>
+      </w:pPr>
+      <w:r>
+        <w:rPr>
+          <w:rFonts w:ascii="Courier New" w:hAnsi="Courier New" w:cs="Courier New"/>
+          <w:sz w:val="22"/>
+          <w:szCs w:val="22"/>
+        </w:rPr>
+        <w:t>A                     D/A</w:t>
+      </w:r>
+    </w:p>
+    <w:p>
+      <w:pPr>
+        <w:rPr>
+          <w:rFonts w:ascii="Courier New" w:hAnsi="Courier New" w:cs="Courier New"/>
+          <w:sz w:val="22"/>
+          <w:szCs w:val="22"/>
+        </w:rPr>
+      </w:pPr>
+      <w:r>
+        <w:rPr>
+          <w:rFonts w:ascii="Courier New" w:hAnsi="Courier New" w:cs="Courier New"/>
+          <w:sz w:val="22"/>
+          <w:szCs w:val="22"/>
+        </w:rPr>
+        <w:t>Anybody could be that guy</w:t>
+      </w:r>
+    </w:p>
+    <w:p>
+      <w:pPr>
+        <w:rPr>
+          <w:rFonts w:ascii="Courier New" w:hAnsi="Courier New" w:cs="Courier New"/>
+          <w:sz w:val="22"/>
+          <w:szCs w:val="22"/>
+        </w:rPr>
+      </w:pPr>
+      <w:r>
+        <w:rPr>
+          <w:rFonts w:ascii="Courier New" w:hAnsi="Courier New" w:cs="Courier New"/>
+          <w:sz w:val="22"/>
+          <w:szCs w:val="22"/>
+        </w:rPr>
+        <w:t xml:space="preserve">A                            </w:t>
       </w:r>
       <w:proofErr w:type="spellStart"/>
       <w:r>
@@ -615,92 +745,58 @@
           <w:sz w:val="22"/>
           <w:szCs w:val="22"/>
         </w:rPr>
-        <w:t>You come to look for a king</w:t>
-      </w:r>
-    </w:p>
-    <w:p>
-      <w:pPr>
-        <w:rPr>
-          <w:rFonts w:ascii="Courier New" w:hAnsi="Courier New" w:cs="Courier New"/>
-          <w:sz w:val="22"/>
-          <w:szCs w:val="22"/>
-        </w:rPr>
-      </w:pPr>
-      <w:r>
-        <w:rPr>
-          <w:rFonts w:ascii="Courier New" w:hAnsi="Courier New" w:cs="Courier New"/>
-          <w:sz w:val="22"/>
-          <w:szCs w:val="22"/>
-        </w:rPr>
-        <w:t xml:space="preserve"> </w:t>
-      </w:r>
-    </w:p>
-    <w:p>
-      <w:pPr>
-        <w:rPr>
-          <w:rFonts w:ascii="Courier New" w:hAnsi="Courier New" w:cs="Courier New"/>
-          <w:sz w:val="22"/>
-          <w:szCs w:val="22"/>
-        </w:rPr>
-      </w:pPr>
-      <w:r>
-        <w:rPr>
-          <w:rFonts w:ascii="Courier New" w:hAnsi="Courier New" w:cs="Courier New"/>
-          <w:sz w:val="22"/>
-          <w:szCs w:val="22"/>
-        </w:rPr>
-        <w:t>[Verse 2]</w:t>
-      </w:r>
-    </w:p>
-    <w:p>
-      <w:pPr>
-        <w:rPr>
-          <w:rFonts w:ascii="Courier New" w:hAnsi="Courier New" w:cs="Courier New"/>
-          <w:sz w:val="22"/>
-          <w:szCs w:val="22"/>
-        </w:rPr>
-      </w:pPr>
-      <w:r>
-        <w:rPr>
-          <w:rFonts w:ascii="Courier New" w:hAnsi="Courier New" w:cs="Courier New"/>
-          <w:sz w:val="22"/>
-          <w:szCs w:val="22"/>
-        </w:rPr>
-        <w:t>A                     D/A</w:t>
-      </w:r>
-    </w:p>
-    <w:p>
-      <w:pPr>
-        <w:rPr>
-          <w:rFonts w:ascii="Courier New" w:hAnsi="Courier New" w:cs="Courier New"/>
-          <w:sz w:val="22"/>
-          <w:szCs w:val="22"/>
-        </w:rPr>
-      </w:pPr>
-      <w:r>
-        <w:rPr>
-          <w:rFonts w:ascii="Courier New" w:hAnsi="Courier New" w:cs="Courier New"/>
-          <w:sz w:val="22"/>
-          <w:szCs w:val="22"/>
-        </w:rPr>
-        <w:t>Anybody could be that guy</w:t>
-      </w:r>
-    </w:p>
-    <w:p>
-      <w:pPr>
-        <w:rPr>
-          <w:rFonts w:ascii="Courier New" w:hAnsi="Courier New" w:cs="Courier New"/>
-          <w:sz w:val="22"/>
-          <w:szCs w:val="22"/>
-        </w:rPr>
-      </w:pPr>
-      <w:r>
-        <w:rPr>
-          <w:rFonts w:ascii="Courier New" w:hAnsi="Courier New" w:cs="Courier New"/>
-          <w:sz w:val="22"/>
-          <w:szCs w:val="22"/>
-        </w:rPr>
-        <w:t xml:space="preserve">A                            </w:t>
+        <w:t>Night is young and the music's high</w:t>
+      </w:r>
+    </w:p>
+    <w:p>
+      <w:pPr>
+        <w:rPr>
+          <w:rFonts w:ascii="Courier New" w:hAnsi="Courier New" w:cs="Courier New"/>
+          <w:sz w:val="22"/>
+          <w:szCs w:val="22"/>
+        </w:rPr>
+      </w:pPr>
+      <w:r>
+        <w:rPr>
+          <w:rFonts w:ascii="Courier New" w:hAnsi="Courier New" w:cs="Courier New"/>
+          <w:sz w:val="22"/>
+          <w:szCs w:val="22"/>
+        </w:rPr>
+        <w:t>E</w:t>
+      </w:r>
+    </w:p>
+    <w:p>
+      <w:pPr>
+        <w:rPr>
+          <w:rFonts w:ascii="Courier New" w:hAnsi="Courier New" w:cs="Courier New"/>
+          <w:sz w:val="22"/>
+          <w:szCs w:val="22"/>
+        </w:rPr>
+      </w:pPr>
+      <w:r>
+        <w:rPr>
+          <w:rFonts w:ascii="Courier New" w:hAnsi="Courier New" w:cs="Courier New"/>
+          <w:sz w:val="22"/>
+          <w:szCs w:val="22"/>
+        </w:rPr>
+        <w:t>With a bit of rock music, everything's fine</w:t>
+      </w:r>
+    </w:p>
+    <w:p>
+      <w:pPr>
+        <w:rPr>
+          <w:rFonts w:ascii="Courier New" w:hAnsi="Courier New" w:cs="Courier New"/>
+          <w:sz w:val="22"/>
+          <w:szCs w:val="22"/>
+        </w:rPr>
+      </w:pPr>
+      <w:r>
+        <w:rPr>
+          <w:rFonts w:ascii="Courier New" w:hAnsi="Courier New" w:cs="Courier New"/>
+          <w:sz w:val="22"/>
+          <w:szCs w:val="22"/>
+        </w:rPr>
+        <w:t xml:space="preserve">              E    </w:t>
       </w:r>
       <w:proofErr w:type="spellStart"/>
       <w:r>
@@ -712,100 +808,40 @@
         <w:t>F#m</w:t>
       </w:r>
       <w:proofErr w:type="spellEnd"/>
-    </w:p>
-    <w:p>
-      <w:pPr>
-        <w:rPr>
-          <w:rFonts w:ascii="Courier New" w:hAnsi="Courier New" w:cs="Courier New"/>
-          <w:sz w:val="22"/>
-          <w:szCs w:val="22"/>
-        </w:rPr>
-      </w:pPr>
-      <w:r>
-        <w:rPr>
-          <w:rFonts w:ascii="Courier New" w:hAnsi="Courier New" w:cs="Courier New"/>
-          <w:sz w:val="22"/>
-          <w:szCs w:val="22"/>
-        </w:rPr>
-        <w:t>Night is young and the music's high</w:t>
-      </w:r>
-    </w:p>
-    <w:p>
-      <w:pPr>
-        <w:rPr>
-          <w:rFonts w:ascii="Courier New" w:hAnsi="Courier New" w:cs="Courier New"/>
-          <w:sz w:val="22"/>
-          <w:szCs w:val="22"/>
-        </w:rPr>
-      </w:pPr>
-      <w:r>
-        <w:rPr>
-          <w:rFonts w:ascii="Courier New" w:hAnsi="Courier New" w:cs="Courier New"/>
-          <w:sz w:val="22"/>
-          <w:szCs w:val="22"/>
-        </w:rPr>
-        <w:t>E</w:t>
-      </w:r>
-    </w:p>
-    <w:p>
-      <w:pPr>
-        <w:rPr>
-          <w:rFonts w:ascii="Courier New" w:hAnsi="Courier New" w:cs="Courier New"/>
-          <w:sz w:val="22"/>
-          <w:szCs w:val="22"/>
-        </w:rPr>
-      </w:pPr>
-      <w:r>
-        <w:rPr>
-          <w:rFonts w:ascii="Courier New" w:hAnsi="Courier New" w:cs="Courier New"/>
-          <w:sz w:val="22"/>
-          <w:szCs w:val="22"/>
-        </w:rPr>
-        <w:t>With a bit of rock music, everything's fine</w:t>
-      </w:r>
-    </w:p>
-    <w:p>
-      <w:pPr>
-        <w:rPr>
-          <w:rFonts w:ascii="Courier New" w:hAnsi="Courier New" w:cs="Courier New"/>
-          <w:sz w:val="22"/>
-          <w:szCs w:val="22"/>
-        </w:rPr>
-      </w:pPr>
-      <w:r>
-        <w:rPr>
-          <w:rFonts w:ascii="Courier New" w:hAnsi="Courier New" w:cs="Courier New"/>
-          <w:sz w:val="22"/>
-          <w:szCs w:val="22"/>
-        </w:rPr>
-        <w:t xml:space="preserve">              E    </w:t>
-      </w:r>
-      <w:proofErr w:type="spellStart"/>
-      <w:r>
-        <w:rPr>
-          <w:rFonts w:ascii="Courier New" w:hAnsi="Courier New" w:cs="Courier New"/>
-          <w:sz w:val="22"/>
-          <w:szCs w:val="22"/>
-        </w:rPr>
-        <w:t>F#m</w:t>
-      </w:r>
-      <w:proofErr w:type="spellEnd"/>
-      <w:r>
-        <w:rPr>
-          <w:rFonts w:ascii="Courier New" w:hAnsi="Courier New" w:cs="Courier New"/>
-          <w:sz w:val="22"/>
-          <w:szCs w:val="22"/>
-        </w:rPr>
-        <w:t xml:space="preserve">            E  </w:t>
-      </w:r>
-      <w:proofErr w:type="spellStart"/>
-      <w:r>
-        <w:rPr>
-          <w:rFonts w:ascii="Courier New" w:hAnsi="Courier New" w:cs="Courier New"/>
-          <w:sz w:val="22"/>
-          <w:szCs w:val="22"/>
-        </w:rPr>
-        <w:t>F#m</w:t>
+      <w:r>
+        <w:rPr>
+          <w:rFonts w:ascii="Courier New" w:hAnsi="Courier New" w:cs="Courier New"/>
+          <w:sz w:val="22"/>
+          <w:szCs w:val="22"/>
+        </w:rPr>
+        <w:t xml:space="preserve">            </w:t>
+      </w:r>
+      <w:proofErr w:type="gramStart"/>
+      <w:r>
+        <w:rPr>
+          <w:rFonts w:ascii="Courier New" w:hAnsi="Courier New" w:cs="Courier New"/>
+          <w:sz w:val="22"/>
+          <w:szCs w:val="22"/>
+        </w:rPr>
+        <w:t xml:space="preserve">E  </w:t>
+      </w:r>
+      <w:proofErr w:type="spellStart"/>
+      <w:r>
+        <w:rPr>
+          <w:rFonts w:ascii="Courier New" w:hAnsi="Courier New" w:cs="Courier New"/>
+          <w:sz w:val="22"/>
+          <w:szCs w:val="22"/>
+        </w:rPr>
+        <w:t>F</w:t>
+      </w:r>
+      <w:proofErr w:type="gramEnd"/>
+      <w:r>
+        <w:rPr>
+          <w:rFonts w:ascii="Courier New" w:hAnsi="Courier New" w:cs="Courier New"/>
+          <w:sz w:val="22"/>
+          <w:szCs w:val="22"/>
+        </w:rPr>
+        <w:t>#m</w:t>
       </w:r>
       <w:proofErr w:type="spellEnd"/>
     </w:p>
@@ -1992,276 +2028,6 @@
         <w:t>A</w:t>
       </w:r>
       <w:proofErr w:type="spellEnd"/>
-    </w:p>
-    <w:p>
-      <w:pPr>
-        <w:rPr>
-          <w:rFonts w:ascii="Courier New" w:hAnsi="Courier New" w:cs="Courier New"/>
-          <w:sz w:val="22"/>
-          <w:szCs w:val="22"/>
-        </w:rPr>
-      </w:pPr>
-      <w:r>
-        <w:rPr>
-          <w:rFonts w:ascii="Courier New" w:hAnsi="Courier New" w:cs="Courier New"/>
-          <w:sz w:val="22"/>
-          <w:szCs w:val="22"/>
-        </w:rPr>
-        <w:t>Digging the dancing queen</w:t>
-      </w:r>
-    </w:p>
-    <w:p>
-      <w:pPr>
-        <w:rPr>
-          <w:rFonts w:ascii="Courier New" w:hAnsi="Courier New" w:cs="Courier New"/>
-          <w:sz w:val="22"/>
-          <w:szCs w:val="22"/>
-        </w:rPr>
-      </w:pPr>
-      <w:r>
-        <w:rPr>
-          <w:rFonts w:ascii="Courier New" w:hAnsi="Courier New" w:cs="Courier New"/>
-          <w:sz w:val="22"/>
-          <w:szCs w:val="22"/>
-        </w:rPr>
-        <w:t xml:space="preserve">    D/F#   A/E</w:t>
-      </w:r>
-    </w:p>
-    <w:p>
-      <w:pPr>
-        <w:rPr>
-          <w:rFonts w:ascii="Courier New" w:hAnsi="Courier New" w:cs="Courier New"/>
-          <w:sz w:val="22"/>
-          <w:szCs w:val="22"/>
-        </w:rPr>
-      </w:pPr>
-      <w:r>
-        <w:rPr>
-          <w:rFonts w:ascii="Courier New" w:hAnsi="Courier New" w:cs="Courier New"/>
-          <w:sz w:val="22"/>
-          <w:szCs w:val="22"/>
-        </w:rPr>
-        <w:t xml:space="preserve">Ooh </w:t>
-      </w:r>
-      <w:proofErr w:type="spellStart"/>
-      <w:r>
-        <w:rPr>
-          <w:rFonts w:ascii="Courier New" w:hAnsi="Courier New" w:cs="Courier New"/>
-          <w:sz w:val="22"/>
-          <w:szCs w:val="22"/>
-        </w:rPr>
-        <w:t>ooh</w:t>
-      </w:r>
-      <w:proofErr w:type="spellEnd"/>
-      <w:r>
-        <w:rPr>
-          <w:rFonts w:ascii="Courier New" w:hAnsi="Courier New" w:cs="Courier New"/>
-          <w:sz w:val="22"/>
-          <w:szCs w:val="22"/>
-        </w:rPr>
-        <w:t xml:space="preserve"> </w:t>
-      </w:r>
-      <w:proofErr w:type="spellStart"/>
-      <w:r>
-        <w:rPr>
-          <w:rFonts w:ascii="Courier New" w:hAnsi="Courier New" w:cs="Courier New"/>
-          <w:sz w:val="22"/>
-          <w:szCs w:val="22"/>
-        </w:rPr>
-        <w:t>ooh</w:t>
-      </w:r>
-      <w:proofErr w:type="spellEnd"/>
-    </w:p>
-    <w:p>
-      <w:pPr>
-        <w:rPr>
-          <w:rFonts w:ascii="Courier New" w:hAnsi="Courier New" w:cs="Courier New"/>
-          <w:sz w:val="22"/>
-          <w:szCs w:val="22"/>
-        </w:rPr>
-      </w:pPr>
-    </w:p>
-    <w:p>
-      <w:pPr>
-        <w:rPr>
-          <w:rFonts w:ascii="Courier New" w:hAnsi="Courier New" w:cs="Courier New"/>
-          <w:sz w:val="22"/>
-          <w:szCs w:val="22"/>
-        </w:rPr>
-      </w:pPr>
-      <w:r>
-        <w:rPr>
-          <w:rFonts w:ascii="Courier New" w:hAnsi="Courier New" w:cs="Courier New"/>
-          <w:sz w:val="22"/>
-          <w:szCs w:val="22"/>
-        </w:rPr>
-        <w:t>[Outro]</w:t>
-      </w:r>
-    </w:p>
-    <w:p>
-      <w:pPr>
-        <w:rPr>
-          <w:rFonts w:ascii="Courier New" w:hAnsi="Courier New" w:cs="Courier New"/>
-          <w:sz w:val="22"/>
-          <w:szCs w:val="22"/>
-        </w:rPr>
-      </w:pPr>
-      <w:r>
-        <w:rPr>
-          <w:rFonts w:ascii="Courier New" w:hAnsi="Courier New" w:cs="Courier New"/>
-          <w:sz w:val="22"/>
-          <w:szCs w:val="22"/>
-        </w:rPr>
-        <w:t>E              C#7/E#</w:t>
-      </w:r>
-    </w:p>
-    <w:p>
-      <w:pPr>
-        <w:rPr>
-          <w:rFonts w:ascii="Courier New" w:hAnsi="Courier New" w:cs="Courier New"/>
-          <w:sz w:val="22"/>
-          <w:szCs w:val="22"/>
-        </w:rPr>
-      </w:pPr>
-      <w:r>
-        <w:rPr>
-          <w:rFonts w:ascii="Courier New" w:hAnsi="Courier New" w:cs="Courier New"/>
-          <w:sz w:val="22"/>
-          <w:szCs w:val="22"/>
-        </w:rPr>
-        <w:t>You can dance, you can jive</w:t>
-      </w:r>
-    </w:p>
-    <w:p>
-      <w:pPr>
-        <w:rPr>
-          <w:rFonts w:ascii="Courier New" w:hAnsi="Courier New" w:cs="Courier New"/>
-          <w:sz w:val="22"/>
-          <w:szCs w:val="22"/>
-        </w:rPr>
-      </w:pPr>
-      <w:proofErr w:type="spellStart"/>
-      <w:r>
-        <w:rPr>
-          <w:rFonts w:ascii="Courier New" w:hAnsi="Courier New" w:cs="Courier New"/>
-          <w:sz w:val="22"/>
-          <w:szCs w:val="22"/>
-        </w:rPr>
-        <w:t>F#m</w:t>
-      </w:r>
-      <w:proofErr w:type="spellEnd"/>
-      <w:r>
-        <w:rPr>
-          <w:rFonts w:ascii="Courier New" w:hAnsi="Courier New" w:cs="Courier New"/>
-          <w:sz w:val="22"/>
-          <w:szCs w:val="22"/>
-        </w:rPr>
-        <w:t xml:space="preserve">                     B/D#</w:t>
-      </w:r>
-    </w:p>
-    <w:p>
-      <w:pPr>
-        <w:rPr>
-          <w:rFonts w:ascii="Courier New" w:hAnsi="Courier New" w:cs="Courier New"/>
-          <w:sz w:val="22"/>
-          <w:szCs w:val="22"/>
-        </w:rPr>
-      </w:pPr>
-      <w:r>
-        <w:rPr>
-          <w:rFonts w:ascii="Courier New" w:hAnsi="Courier New" w:cs="Courier New"/>
-          <w:sz w:val="22"/>
-          <w:szCs w:val="22"/>
-        </w:rPr>
-        <w:t>Having the time of your life</w:t>
-      </w:r>
-    </w:p>
-    <w:p>
-      <w:pPr>
-        <w:rPr>
-          <w:rFonts w:ascii="Courier New" w:hAnsi="Courier New" w:cs="Courier New"/>
-          <w:sz w:val="22"/>
-          <w:szCs w:val="22"/>
-        </w:rPr>
-      </w:pPr>
-      <w:r>
-        <w:rPr>
-          <w:rFonts w:ascii="Courier New" w:hAnsi="Courier New" w:cs="Courier New"/>
-          <w:sz w:val="22"/>
-          <w:szCs w:val="22"/>
-        </w:rPr>
-        <w:t xml:space="preserve">             D              Bm</w:t>
-      </w:r>
-    </w:p>
-    <w:p>
-      <w:pPr>
-        <w:rPr>
-          <w:rFonts w:ascii="Courier New" w:hAnsi="Courier New" w:cs="Courier New"/>
-          <w:sz w:val="22"/>
-          <w:szCs w:val="22"/>
-        </w:rPr>
-      </w:pPr>
-      <w:r>
-        <w:rPr>
-          <w:rFonts w:ascii="Courier New" w:hAnsi="Courier New" w:cs="Courier New"/>
-          <w:sz w:val="22"/>
-          <w:szCs w:val="22"/>
-        </w:rPr>
-        <w:t xml:space="preserve">Ooh </w:t>
-      </w:r>
-      <w:proofErr w:type="spellStart"/>
-      <w:r>
-        <w:rPr>
-          <w:rFonts w:ascii="Courier New" w:hAnsi="Courier New" w:cs="Courier New"/>
-          <w:sz w:val="22"/>
-          <w:szCs w:val="22"/>
-        </w:rPr>
-        <w:t>ooh</w:t>
-      </w:r>
-      <w:proofErr w:type="spellEnd"/>
-      <w:r>
-        <w:rPr>
-          <w:rFonts w:ascii="Courier New" w:hAnsi="Courier New" w:cs="Courier New"/>
-          <w:sz w:val="22"/>
-          <w:szCs w:val="22"/>
-        </w:rPr>
-        <w:t xml:space="preserve"> </w:t>
-      </w:r>
-      <w:proofErr w:type="spellStart"/>
-      <w:r>
-        <w:rPr>
-          <w:rFonts w:ascii="Courier New" w:hAnsi="Courier New" w:cs="Courier New"/>
-          <w:sz w:val="22"/>
-          <w:szCs w:val="22"/>
-        </w:rPr>
-        <w:t>ooh</w:t>
-      </w:r>
-      <w:proofErr w:type="spellEnd"/>
-      <w:r>
-        <w:rPr>
-          <w:rFonts w:ascii="Courier New" w:hAnsi="Courier New" w:cs="Courier New"/>
-          <w:sz w:val="22"/>
-          <w:szCs w:val="22"/>
-        </w:rPr>
-        <w:t>, see that girl, watch that scene</w:t>
-      </w:r>
-    </w:p>
-    <w:p>
-      <w:pPr>
-        <w:rPr>
-          <w:rFonts w:ascii="Courier New" w:hAnsi="Courier New" w:cs="Courier New"/>
-          <w:sz w:val="22"/>
-          <w:szCs w:val="22"/>
-        </w:rPr>
-      </w:pPr>
-      <w:r>
-        <w:rPr>
-          <w:rFonts w:ascii="Courier New" w:hAnsi="Courier New" w:cs="Courier New"/>
-          <w:sz w:val="22"/>
-          <w:szCs w:val="22"/>
-        </w:rPr>
-        <w:t>N.C.                  A D    E A</w:t>
-      </w:r>
     </w:p>
     <w:p>
       <w:pPr>

</xml_diff>